<commit_message>
simplify: keep only NIM input and update documentation
</commit_message>
<xml_diff>
--- a/docs/laporan-praktikum.docx
+++ b/docs/laporan-praktikum.docx
@@ -82,7 +82,7 @@
         <w:pStyle w:val="ListNumber"/>
       </w:pPr>
       <w:r>
-        <w:t>Buka http://127.0.0.1:5173, isi identitas dan NIM, lalu tekan Hitung hasil.</w:t>
+        <w:t>Buka http://127.0.0.1:5173, isi NIM, lalu tekan Hitung hasil.</w:t>
       </w:r>
     </w:p>
     <w:p>
@@ -240,7 +240,7 @@
       <w:r>
         <w:drawing>
           <wp:inline xmlns:a="http://schemas.openxmlformats.org/drawingml/2006/main" xmlns:pic="http://schemas.openxmlformats.org/drawingml/2006/picture">
-            <wp:extent cx="6217920" cy="6074022"/>
+            <wp:extent cx="6217920" cy="5744570"/>
             <wp:docPr id="1" name="Picture 1"/>
             <wp:cNvGraphicFramePr>
               <a:graphicFrameLocks noChangeAspect="1"/>
@@ -261,7 +261,7 @@
                   <pic:spPr>
                     <a:xfrm>
                       <a:off x="0" y="0"/>
-                      <a:ext cx="6217920" cy="6074022"/>
+                      <a:ext cx="6217920" cy="5744570"/>
                     </a:xfrm>
                     <a:prstGeom prst="rect"/>
                   </pic:spPr>
@@ -1033,30 +1033,6 @@
           <w:rFonts w:ascii="Consolas" w:hAnsi="Consolas"/>
           <w:sz w:val="16"/>
         </w:rPr>
-        <w:t>const name = document.querySelector&lt;HTMLInputElement&gt;('#name')!;</w:t>
-      </w:r>
-    </w:p>
-    <w:p>
-      <w:pPr>
-        <w:spacing w:after="0" w:line="240" w:lineRule="auto"/>
-      </w:pPr>
-      <w:r>
-        <w:rPr>
-          <w:rFonts w:ascii="Consolas" w:hAnsi="Consolas"/>
-          <w:sz w:val="16"/>
-        </w:rPr>
-        <w:t>const studentClass = document.querySelector&lt;HTMLInputElement&gt;('#class')!;</w:t>
-      </w:r>
-    </w:p>
-    <w:p>
-      <w:pPr>
-        <w:spacing w:after="0" w:line="240" w:lineRule="auto"/>
-      </w:pPr>
-      <w:r>
-        <w:rPr>
-          <w:rFonts w:ascii="Consolas" w:hAnsi="Consolas"/>
-          <w:sz w:val="16"/>
-        </w:rPr>
         <w:t>const results = document.querySelector&lt;HTMLElement&gt;('#results')!;</w:t>
       </w:r>
     </w:p>
@@ -1377,19 +1353,7 @@
           <w:rFonts w:ascii="Consolas" w:hAnsi="Consolas"/>
           <w:sz w:val="16"/>
         </w:rPr>
-        <w:t xml:space="preserve">    const identity = [name.value.trim(), studentClass.value.trim()].filter(Boolean);</w:t>
-      </w:r>
-    </w:p>
-    <w:p>
-      <w:pPr>
-        <w:spacing w:after="0" w:line="240" w:lineRule="auto"/>
-      </w:pPr>
-      <w:r>
-        <w:rPr>
-          <w:rFonts w:ascii="Consolas" w:hAnsi="Consolas"/>
-          <w:sz w:val="16"/>
-        </w:rPr>
-        <w:t xml:space="preserve">    status.textContent = [...identity, `Hasil untuk NIM ${data.nim}`].join(' · ');</w:t>
+        <w:t xml:space="preserve">    status.textContent = `Hasil untuk NIM ${data.nim}`;</w:t>
       </w:r>
     </w:p>
     <w:p>
@@ -1887,78 +1851,6 @@
           <w:rFonts w:ascii="Consolas" w:hAnsi="Consolas"/>
           <w:sz w:val="16"/>
         </w:rPr>
-        <w:t xml:space="preserve">        &lt;div class="identity-fields"&gt;</w:t>
-      </w:r>
-    </w:p>
-    <w:p>
-      <w:pPr>
-        <w:spacing w:after="0" w:line="240" w:lineRule="auto"/>
-      </w:pPr>
-      <w:r>
-        <w:rPr>
-          <w:rFonts w:ascii="Consolas" w:hAnsi="Consolas"/>
-          <w:sz w:val="16"/>
-        </w:rPr>
-        <w:t xml:space="preserve">          &lt;label&gt;Nama &lt;span class="optional"&gt;opsional&lt;/span&gt;&lt;input id="name" type="text" </w:t>
-      </w:r>
-    </w:p>
-    <w:p>
-      <w:pPr>
-        <w:spacing w:after="0" w:line="240" w:lineRule="auto"/>
-      </w:pPr>
-      <w:r>
-        <w:rPr>
-          <w:rFonts w:ascii="Consolas" w:hAnsi="Consolas"/>
-          <w:sz w:val="16"/>
-        </w:rPr>
-        <w:t>placeholder="Nama lengkap Anda" autocomplete="name" /&gt;&lt;/label&gt;</w:t>
-      </w:r>
-    </w:p>
-    <w:p>
-      <w:pPr>
-        <w:spacing w:after="0" w:line="240" w:lineRule="auto"/>
-      </w:pPr>
-      <w:r>
-        <w:rPr>
-          <w:rFonts w:ascii="Consolas" w:hAnsi="Consolas"/>
-          <w:sz w:val="16"/>
-        </w:rPr>
-        <w:t xml:space="preserve">          &lt;label&gt;Kelas &lt;span class="optional"&gt;opsional&lt;/span&gt;&lt;input id="class" type="text" </w:t>
-      </w:r>
-    </w:p>
-    <w:p>
-      <w:pPr>
-        <w:spacing w:after="0" w:line="240" w:lineRule="auto"/>
-      </w:pPr>
-      <w:r>
-        <w:rPr>
-          <w:rFonts w:ascii="Consolas" w:hAnsi="Consolas"/>
-          <w:sz w:val="16"/>
-        </w:rPr>
-        <w:t>placeholder="Contoh: TI-1A" /&gt;&lt;/label&gt;</w:t>
-      </w:r>
-    </w:p>
-    <w:p>
-      <w:pPr>
-        <w:spacing w:after="0" w:line="240" w:lineRule="auto"/>
-      </w:pPr>
-      <w:r>
-        <w:rPr>
-          <w:rFonts w:ascii="Consolas" w:hAnsi="Consolas"/>
-          <w:sz w:val="16"/>
-        </w:rPr>
-        <w:t xml:space="preserve">        &lt;/div&gt;</w:t>
-      </w:r>
-    </w:p>
-    <w:p>
-      <w:pPr>
-        <w:spacing w:after="0" w:line="240" w:lineRule="auto"/>
-      </w:pPr>
-      <w:r>
-        <w:rPr>
-          <w:rFonts w:ascii="Consolas" w:hAnsi="Consolas"/>
-          <w:sz w:val="16"/>
-        </w:rPr>
         <w:t xml:space="preserve">        &lt;label for="nim"&gt;Nomor Induk Mahasiswa &lt;span class="required"&gt;*&lt;/span&gt;&lt;/label&gt;</w:t>
       </w:r>
     </w:p>
@@ -2709,43 +2601,7 @@
           <w:rFonts w:ascii="Consolas" w:hAnsi="Consolas"/>
           <w:sz w:val="16"/>
         </w:rPr>
-        <w:t xml:space="preserve">.identity-fields { display: grid; grid-template-columns: 1fr 1fr; gap: 18px; margin-bottom: </w:t>
-      </w:r>
-    </w:p>
-    <w:p>
-      <w:pPr>
-        <w:spacing w:after="0" w:line="240" w:lineRule="auto"/>
-      </w:pPr>
-      <w:r>
-        <w:rPr>
-          <w:rFonts w:ascii="Consolas" w:hAnsi="Consolas"/>
-          <w:sz w:val="16"/>
-        </w:rPr>
-        <w:t>18px; }</w:t>
-      </w:r>
-    </w:p>
-    <w:p>
-      <w:pPr>
-        <w:spacing w:after="0" w:line="240" w:lineRule="auto"/>
-      </w:pPr>
-      <w:r>
-        <w:rPr>
-          <w:rFonts w:ascii="Consolas" w:hAnsi="Consolas"/>
-          <w:sz w:val="16"/>
-        </w:rPr>
         <w:t>label { display: block; font-size: 13px; font-weight: 600; }</w:t>
-      </w:r>
-    </w:p>
-    <w:p>
-      <w:pPr>
-        <w:spacing w:after="0" w:line="240" w:lineRule="auto"/>
-      </w:pPr>
-      <w:r>
-        <w:rPr>
-          <w:rFonts w:ascii="Consolas" w:hAnsi="Consolas"/>
-          <w:sz w:val="16"/>
-        </w:rPr>
-        <w:t>.optional { margin-left: 5px; font-weight: 400; color: #a5afbf; font-size: 11px; }</w:t>
       </w:r>
     </w:p>
     <w:p>
@@ -3189,7 +3045,7 @@
           <w:rFonts w:ascii="Consolas" w:hAnsi="Consolas"/>
           <w:sz w:val="16"/>
         </w:rPr>
-        <w:t xml:space="preserve">@media (max-width: 560px) { .container { padding: 26px 16px; } .card { padding: 20px; } </w:t>
+        <w:t>@media (max-width: 560px) { .container { padding: 26px 16px; } .card { padding: 20px; } .card-</w:t>
       </w:r>
     </w:p>
     <w:p>
@@ -3201,7 +3057,7 @@
           <w:rFonts w:ascii="Consolas" w:hAnsi="Consolas"/>
           <w:sz w:val="16"/>
         </w:rPr>
-        <w:t>.identity-fields { grid-template-columns: 1fr; } .card-title { align-items: flex-start; flex-</w:t>
+        <w:t>title { align-items: flex-start; flex-direction: column; gap: 4px; } .result-card { gap: 12px;</w:t>
       </w:r>
     </w:p>
     <w:p>
@@ -3213,7 +3069,7 @@
           <w:rFonts w:ascii="Consolas" w:hAnsi="Consolas"/>
           <w:sz w:val="16"/>
         </w:rPr>
-        <w:t>direction: column; gap: 4px; } .result-card { gap: 12px; padding: 18px 14px; } footer { flex-</w:t>
+        <w:t xml:space="preserve"> padding: 18px 14px; } footer { flex-direction: column; } .badge { font-size: 9px; padding: </w:t>
       </w:r>
     </w:p>
     <w:p>
@@ -3225,7 +3081,7 @@
           <w:rFonts w:ascii="Consolas" w:hAnsi="Consolas"/>
           <w:sz w:val="16"/>
         </w:rPr>
-        <w:t>direction: column; } .badge { font-size: 9px; padding: 7px; } }</w:t>
+        <w:t>7px; } }</w:t>
       </w:r>
     </w:p>
     <w:sectPr>

</xml_diff>